<commit_message>
minor fix to fonts
</commit_message>
<xml_diff>
--- a/docs/admin/overview.docx
+++ b/docs/admin/overview.docx
@@ -1203,8 +1203,8 @@
       <w:rFonts w:asciiTheme="majorHAnsi" w:cstheme="majorBidi" w:eastAsiaTheme="majorEastAsia" w:hAnsiTheme="majorHAnsi"/>
       <w:spacing w:val="-10"/>
       <w:kern w:val="28"/>
-      <w:sz w:val="56"/>
-      <w:szCs w:val="56"/>
+      <w:sz w:val="40"/>
+      <w:szCs w:val="40"/>
     </w:rPr>
   </w:style>
   <w:style w:customStyle="1" w:styleId="TitleChar" w:type="character">
@@ -1217,8 +1217,8 @@
       <w:rFonts w:asciiTheme="majorHAnsi" w:cstheme="majorBidi" w:eastAsiaTheme="majorEastAsia" w:hAnsiTheme="majorHAnsi"/>
       <w:spacing w:val="-10"/>
       <w:kern w:val="28"/>
-      <w:sz w:val="56"/>
-      <w:szCs w:val="56"/>
+      <w:sz w:val="40"/>
+      <w:szCs w:val="40"/>
     </w:rPr>
   </w:style>
   <w:style w:styleId="Subtitle" w:type="paragraph">

</xml_diff>